<commit_message>
fix(word): correctifs de la revue R25 sur le lecteur (tableaux, listes, images, sections)
colspan borné à la grille et à 63, zone de texte avec image signalée,
compteurs de listes par document (une liste coupée par un tableau
continue), mc:AlternateContent classifié et converti, w:customXml de
bloc traversé, numId inconnu averti, start borné, continuation de
fusion incohérente non fusionnée, tableau sans ligne ignoré, URL
d'upload filtrée et dimensions d'image bornées, bornes de page et de
colonnes, appel de note retiré sans son run, continuation d'item
limitée aux paragraphes, chaque forme signalée. Retraits de
numérotation retirés des items (idempotence avec le core). Fixture 17
complétée (mc:AlternateContent, w:customXml).

Co-Authored-By: Claude Fable 5.1 <noreply@anthropic.com>
</commit_message>
<xml_diff>
--- a/fixtures/docx/17-objets-perdus.docx
+++ b/fixtures/docx/17-objets-perdus.docx
@@ -249,6 +249,112 @@
     <w:p>
       <w:r>
         <w:t xml:space="preserve">Après l’objet incorporé</w:t>
+      </w:r>
+    </w:p>
+    <w:p>
+      <w:r>
+        <w:t xml:space="preserve">Avant la zone de texte Word 2010+</w:t>
+      </w:r>
+    </w:p>
+    <w:p>
+      <w:r>
+        <w:t xml:space="preserve">Zone de texte enveloppée (mc:AlternateContent) : </w:t>
+      </w:r>
+      <w:r>
+        <mc:AlternateContent>
+          <mc:Choice Requires="wps">
+            <w:drawing>
+              <wp:inline distT="0" distB="0" distL="0" distR="0">
+                <wp:extent cx="2286000" cy="914400"/>
+                <wp:docPr id="103" name="Zone de texte 3"/>
+                <a:graphic xmlns:a="http://schemas.openxmlformats.org/drawingml/2006/main">
+                  <a:graphicData uri="http://schemas.microsoft.com/office/word/2010/wordprocessingShape">
+                    <wps:wsp>
+                      <wps:cNvSpPr txBox="1"/>
+                      <wps:spPr>
+                        <a:xfrm>
+                          <a:off x="0" y="0"/>
+                          <a:ext cx="2286000" cy="914400"/>
+                        </a:xfrm>
+                        <a:prstGeom prst="rect">
+                          <a:avLst/>
+                        </a:prstGeom>
+                        <a:solidFill>
+                          <a:srgbClr val="DEEAF6"/>
+                        </a:solidFill>
+                        <a:ln>
+                          <a:solidFill>
+                            <a:srgbClr val="2F5496"/>
+                          </a:solidFill>
+                        </a:ln>
+                      </wps:spPr>
+                      <wps:txbx>
+                        <w:txbxContent>
+                          <w:p>
+                            <w:r>
+                              <w:t>Texte dans la zone de texte Word 2010+</w:t>
+                            </w:r>
+                          </w:p>
+                        </w:txbxContent>
+                      </wps:txbx>
+                      <wps:bodyPr wrap="square" rtlCol="0">
+                        <a:noAutofit/>
+                      </wps:bodyPr>
+                    </wps:wsp>
+                  </a:graphicData>
+                </a:graphic>
+              </wp:inline>
+            </w:drawing>
+          </mc:Choice>
+          <mc:Fallback>
+            <w:pict>
+              <v:shape id="Zone de texte 3" type="#_x0000_t202" style="width:180pt;height:72pt">
+                <v:textbox>
+                  <w:txbxContent>
+                    <w:p>
+                      <w:r>
+                        <w:t>Texte dans la zone de texte Word 2010+</w:t>
+                      </w:r>
+                    </w:p>
+                  </w:txbxContent>
+                </v:textbox>
+              </v:shape>
+            </w:pict>
+          </mc:Fallback>
+        </mc:AlternateContent>
+      </w:r>
+      <w:r>
+        <w:t xml:space="preserve"/>
+      </w:r>
+    </w:p>
+    <w:p>
+      <w:r>
+        <w:t xml:space="preserve">Après la zone de texte Word 2010+</w:t>
+      </w:r>
+    </w:p>
+    <w:p>
+      <w:r>
+        <w:t xml:space="preserve">Avant le bloc customXml</w:t>
+      </w:r>
+    </w:p>
+    <w:customXml w:uri="urn:aster:fixture" w:element="section">
+      <w:customXmlPr>
+        <w:placeholder w:val="Section"/>
+      </w:customXmlPr>
+      <w:p>
+        <w:r>
+          <w:t>Paragraphe 1 dans w:customXml</w:t>
+        </w:r>
+      </w:p>
+      <w:p>
+        <w:r>
+          <w:t>Paragraphe 2 dans w:customXml</w:t>
+        </w:r>
+      </w:p>
+    </w:customXml>
+    <w:p>
+      <w:r>
+        <w:t xml:space="preserve">Après le bloc customXml</w:t>
       </w:r>
     </w:p>
     <w:sectPr>

</xml_diff>